<commit_message>
fix brainstorm task priority labels
</commit_message>
<xml_diff>
--- a/worlds/ondina-vasquell/submission/Ondina_Vasquell_Brainstorm.docx
+++ b/worlds/ondina-vasquell/submission/Ondina_Vasquell_Brainstorm.docx
@@ -713,7 +713,7 @@
               <w:rPr>
                 <w:sz w:val="18"/>
               </w:rPr>
-              <w:t>Ten tasks, each an independent post-snapshot encounter, each mapped to an approved tracker workflow and named with its requester, structure, forced slot, task-level trap, and anchor. Ten distinct workflows are intentional: consolidating them would blur real, distinct physician-facing deliverables, and each task still names its structural category and forcing function so variety is visible at a glance.</w:t>
+              <w:t>Ten tasks, each an independent post-snapshot encounter, each mapped to an approved tracker workflow and named with its requester, priority label, structure, forced slot, task-level trap, and anchor. Ten distinct workflows are intentional: consolidating them would blur real, distinct physician-facing deliverables, and each task still names its structural category and forcing function so variety is visible at a glance.</w:t>
             </w:r>
           </w:p>
           <w:p>
@@ -744,6 +744,14 @@
               <w:rPr>
                 <w:sz w:val="18"/>
               </w:rPr>
+              <w:t>Priority: P0.</w:t>
+            </w:r>
+          </w:p>
+          <w:p>
+            <w:r>
+              <w:rPr>
+                <w:sz w:val="18"/>
+              </w:rPr>
               <w:t>Requester and anchor: Hospitalist attending, May 22, 2026 at 08:30.</w:t>
             </w:r>
           </w:p>
@@ -791,6 +799,14 @@
               <w:rPr>
                 <w:sz w:val="18"/>
               </w:rPr>
+              <w:t>Priority: P0.</w:t>
+            </w:r>
+          </w:p>
+          <w:p>
+            <w:r>
+              <w:rPr>
+                <w:sz w:val="18"/>
+              </w:rPr>
               <w:t>Requester and anchor: HIM coding lead, May 22, 2026 at 09:00.</w:t>
             </w:r>
           </w:p>
@@ -838,6 +854,14 @@
               <w:rPr>
                 <w:sz w:val="18"/>
               </w:rPr>
+              <w:t>Priority: P0.</w:t>
+            </w:r>
+          </w:p>
+          <w:p>
+            <w:r>
+              <w:rPr>
+                <w:sz w:val="18"/>
+              </w:rPr>
               <w:t>Requester and anchor: CDI specialist, May 24, 2026 at 10:00.</w:t>
             </w:r>
           </w:p>
@@ -885,6 +909,14 @@
               <w:rPr>
                 <w:sz w:val="18"/>
               </w:rPr>
+              <w:t>Priority: P0.</w:t>
+            </w:r>
+          </w:p>
+          <w:p>
+            <w:r>
+              <w:rPr>
+                <w:sz w:val="18"/>
+              </w:rPr>
               <w:t>Requester and anchor: Hospitalist attending, at case management request, May 24, 2026 at 15:00.</w:t>
             </w:r>
           </w:p>
@@ -932,6 +964,14 @@
               <w:rPr>
                 <w:sz w:val="18"/>
               </w:rPr>
+              <w:t>Priority: P0.</w:t>
+            </w:r>
+          </w:p>
+          <w:p>
+            <w:r>
+              <w:rPr>
+                <w:sz w:val="18"/>
+              </w:rPr>
               <w:t>Requester and anchor: Inpatient pharmacist, May 25, 2026 at 09:00.</w:t>
             </w:r>
           </w:p>
@@ -979,6 +1019,14 @@
               <w:rPr>
                 <w:sz w:val="18"/>
               </w:rPr>
+              <w:t>Priority: P1.</w:t>
+            </w:r>
+          </w:p>
+          <w:p>
+            <w:r>
+              <w:rPr>
+                <w:sz w:val="18"/>
+              </w:rPr>
               <w:t>Requester and anchor: Physician advisor, May 26, 2026 at 11:00.</w:t>
             </w:r>
           </w:p>
@@ -1026,6 +1074,14 @@
               <w:rPr>
                 <w:sz w:val="18"/>
               </w:rPr>
+              <w:t>Priority: P0.</w:t>
+            </w:r>
+          </w:p>
+          <w:p>
+            <w:r>
+              <w:rPr>
+                <w:sz w:val="18"/>
+              </w:rPr>
               <w:t>Requester and anchor: Quality abstraction nurse, June 4, 2026 at 09:00.</w:t>
             </w:r>
           </w:p>
@@ -1073,6 +1129,14 @@
               <w:rPr>
                 <w:sz w:val="18"/>
               </w:rPr>
+              <w:t>Priority: P0.</w:t>
+            </w:r>
+          </w:p>
+          <w:p>
+            <w:r>
+              <w:rPr>
+                <w:sz w:val="18"/>
+              </w:rPr>
               <w:t>Requester and anchor: Hospitalist attending, June 8, 2026 at 14:00.</w:t>
             </w:r>
           </w:p>
@@ -1120,6 +1184,14 @@
               <w:rPr>
                 <w:sz w:val="18"/>
               </w:rPr>
+              <w:t>Priority: P0.</w:t>
+            </w:r>
+          </w:p>
+          <w:p>
+            <w:r>
+              <w:rPr>
+                <w:sz w:val="18"/>
+              </w:rPr>
               <w:t>Requester and anchor: Patient safety officer, June 11, 2026 at 10:00.</w:t>
             </w:r>
           </w:p>
@@ -1167,6 +1239,14 @@
               <w:rPr>
                 <w:sz w:val="18"/>
               </w:rPr>
+              <w:t>Priority: P0.</w:t>
+            </w:r>
+          </w:p>
+          <w:p>
+            <w:r>
+              <w:rPr>
+                <w:sz w:val="18"/>
+              </w:rPr>
               <w:t>Requester and anchor: Discharging attending, May 22, 2026 at 10:00.</w:t>
             </w:r>
           </w:p>
@@ -1198,7 +1278,7 @@
               <w:rPr>
                 <w:sz w:val="18"/>
               </w:rPr>
-              <w:t>Structure spread: ten tasks across seven distinct structural categories: forced inventory x2, external ratify-or-refute x3, determination, extraction to schema, synthesis with a required table, investigation, and one completion task. Nine of ten workflows are P0. Payer criteria and external positions enter as realistic attached documents; the shared chart stays raw, with no single summary that states the conclusions.</w:t>
+              <w:t>Structure spread: ten tasks across seven distinct structural categories: forced inventory x2, external ratify-or-refute x3, determination, extraction to schema, synthesis with a required table, investigation, and one completion task. Priority spread is explicit per task: Tasks 1-5 and 7-10 are P0, and Task 6 is P1. Payer criteria and external positions enter as realistic attached documents; the shared chart stays raw, with no single summary that states the conclusions.</w:t>
             </w:r>
           </w:p>
           <w:p>

</xml_diff>